<commit_message>
Drop 'Currently at Rocket Devs' from resume summary
Summary now leads with the years of experience and what was shipped,
not the current employer — the employer is already prominent under
Experience.
</commit_message>
<xml_diff>
--- a/public/uzair-saleem-resume.docx
+++ b/public/uzair-saleem-resume.docx
@@ -45,7 +45,7 @@
         </w:rPr>
         <w:t xml:space="preserve">Islamabad, Pakistan  ·  </w:t>
       </w:r>
-      <w:hyperlink w:history="1" r:id="rIdi6tmalh4-bpdzv7wumija">
+      <w:hyperlink w:history="1" r:id="rIdymc4dhbqmuy2m9th3t5nq">
         <w:r>
           <w:rPr>
             <w:rFonts w:ascii="Arial" w:cs="Arial" w:eastAsia="Arial" w:hAnsi="Arial"/>
@@ -66,7 +66,7 @@
         </w:rPr>
         <w:t xml:space="preserve">  ·  </w:t>
       </w:r>
-      <w:hyperlink w:history="1" r:id="rId14mru3zb_mpdxzmpumhhr">
+      <w:hyperlink w:history="1" r:id="rIdojonbvjlaj3xpn5q0snbw">
         <w:r>
           <w:rPr>
             <w:rFonts w:ascii="Arial" w:cs="Arial" w:eastAsia="Arial" w:hAnsi="Arial"/>
@@ -87,7 +87,7 @@
         </w:rPr>
         <w:t xml:space="preserve">  ·  </w:t>
       </w:r>
-      <w:hyperlink w:history="1" r:id="rIdco7dkf1zhuob4r4ck5vcv">
+      <w:hyperlink w:history="1" r:id="rIdtcwlhvl9ch0adkzfgl5zv">
         <w:r>
           <w:rPr>
             <w:rFonts w:ascii="Arial" w:cs="Arial" w:eastAsia="Arial" w:hAnsi="Arial"/>
@@ -108,7 +108,7 @@
         </w:rPr>
         <w:t xml:space="preserve">  ·  </w:t>
       </w:r>
-      <w:hyperlink w:history="1" r:id="rIdrxi0rtf3pm4swu4t57xql">
+      <w:hyperlink w:history="1" r:id="rIdk2gienpvo61mkhfhtwna2">
         <w:r>
           <w:rPr>
             <w:rFonts w:ascii="Arial" w:cs="Arial" w:eastAsia="Arial" w:hAnsi="Arial"/>
@@ -129,7 +129,7 @@
         </w:rPr>
         <w:t xml:space="preserve">  ·  </w:t>
       </w:r>
-      <w:hyperlink w:history="1" r:id="rIdc6--nuhcddsbnvwgrnrp-">
+      <w:hyperlink w:history="1" r:id="rIdw1-itif_uqw9_kb-yqk7e">
         <w:r>
           <w:rPr>
             <w:rFonts w:ascii="Arial" w:cs="Arial" w:eastAsia="Arial" w:hAnsi="Arial"/>
@@ -173,7 +173,7 @@
           <w:sz w:val="18"/>
           <w:szCs w:val="18"/>
         </w:rPr>
-        <w:t xml:space="preserve">Senior Full-Stack Engineer with 4+ years shipping production SaaS end-to-end — frontend, backend, infra, and AI-powered features. Currently at Rocket Devs, where I've shipped three production SaaS products solo for founder clients in the US, EU, and MENA. Holding a high bar for correctness: integer-cent money handling, idempotent webhooks, parity-first migrations.</w:t>
+        <w:t xml:space="preserve">Senior Full-Stack Engineer with 4+ years shipping production SaaS end-to-end — frontend, backend, infra, and AI-powered features. Shipped three production SaaS products solo for founder clients in the US, EU, and MENA. Holding a high bar for correctness: integer-cent money handling, idempotent webhooks, parity-first migrations.</w:t>
       </w:r>
     </w:p>
     <w:p>
@@ -961,7 +961,7 @@
         </w:rPr>
         <w:t xml:space="preserve">	</w:t>
       </w:r>
-      <w:hyperlink w:history="1" r:id="rIdcv8ialmoi8wa2hcwn5ras">
+      <w:hyperlink w:history="1" r:id="rIdnw3n9rad4k2y5x2mj2sdp">
         <w:r>
           <w:rPr>
             <w:rFonts w:ascii="Arial" w:cs="Arial" w:eastAsia="Arial" w:hAnsi="Arial"/>
@@ -1025,7 +1025,7 @@
         </w:rPr>
         <w:t xml:space="preserve">	</w:t>
       </w:r>
-      <w:hyperlink w:history="1" r:id="rIdi5zatrtpekhz2ynewltf4">
+      <w:hyperlink w:history="1" r:id="rIdbskqwl7hlvt1x1at3valb">
         <w:r>
           <w:rPr>
             <w:rFonts w:ascii="Arial" w:cs="Arial" w:eastAsia="Arial" w:hAnsi="Arial"/>
@@ -1089,7 +1089,7 @@
         </w:rPr>
         <w:t xml:space="preserve">	</w:t>
       </w:r>
-      <w:hyperlink w:history="1" r:id="rIdtfuhetkswdg5ggtnrmcu0">
+      <w:hyperlink w:history="1" r:id="rIdl5z6hqj1as-r17b87rzjg">
         <w:r>
           <w:rPr>
             <w:rFonts w:ascii="Arial" w:cs="Arial" w:eastAsia="Arial" w:hAnsi="Arial"/>
@@ -1151,7 +1151,7 @@
       <w:pPr>
         <w:spacing w:after="40" w:line="240"/>
       </w:pPr>
-      <w:hyperlink w:history="1" r:id="rIdp9h8dblqhljrh8-ytvacc">
+      <w:hyperlink w:history="1" r:id="rIdtg7fcktiiponqhrofqy5d">
         <w:r>
           <w:rPr>
             <w:rFonts w:ascii="Arial" w:cs="Arial" w:eastAsia="Arial" w:hAnsi="Arial"/>
@@ -1179,7 +1179,7 @@
       <w:pPr>
         <w:spacing w:after="40" w:line="240"/>
       </w:pPr>
-      <w:hyperlink w:history="1" r:id="rId1b_cujpeys_cvyoqkt3du">
+      <w:hyperlink w:history="1" r:id="rIdn98wqzuiczc9snsza6adg">
         <w:r>
           <w:rPr>
             <w:rFonts w:ascii="Arial" w:cs="Arial" w:eastAsia="Arial" w:hAnsi="Arial"/>
@@ -1207,7 +1207,7 @@
       <w:pPr>
         <w:spacing w:after="40" w:line="240"/>
       </w:pPr>
-      <w:hyperlink w:history="1" r:id="rIdagfd117utyhroah6uuwcl">
+      <w:hyperlink w:history="1" r:id="rIdpaalr9fvv2eepa9lhfbx9">
         <w:r>
           <w:rPr>
             <w:rFonts w:ascii="Arial" w:cs="Arial" w:eastAsia="Arial" w:hAnsi="Arial"/>

</xml_diff>

<commit_message>
Resume: Apifiny → Onsite, education dates → Nov 2018–May 2022
- Apifiny entry now reads 'Onsite' instead of 'Remote'.
- Education BS dates updated from Nov 2022–May 2026 to Nov 2018–May 2022.
- Removed stale '2026' grad-year mention from portfolio About section.
</commit_message>
<xml_diff>
--- a/public/uzair-saleem-resume.docx
+++ b/public/uzair-saleem-resume.docx
@@ -45,7 +45,7 @@
         </w:rPr>
         <w:t xml:space="preserve">Islamabad, Pakistan  ·  </w:t>
       </w:r>
-      <w:hyperlink w:history="1" r:id="rIdymc4dhbqmuy2m9th3t5nq">
+      <w:hyperlink w:history="1" r:id="rIdlbh99gkqafzjn07k9osod">
         <w:r>
           <w:rPr>
             <w:rFonts w:ascii="Arial" w:cs="Arial" w:eastAsia="Arial" w:hAnsi="Arial"/>
@@ -66,7 +66,7 @@
         </w:rPr>
         <w:t xml:space="preserve">  ·  </w:t>
       </w:r>
-      <w:hyperlink w:history="1" r:id="rIdojonbvjlaj3xpn5q0snbw">
+      <w:hyperlink w:history="1" r:id="rIdgev8s-q4c_014mn7sm51z">
         <w:r>
           <w:rPr>
             <w:rFonts w:ascii="Arial" w:cs="Arial" w:eastAsia="Arial" w:hAnsi="Arial"/>
@@ -87,7 +87,7 @@
         </w:rPr>
         <w:t xml:space="preserve">  ·  </w:t>
       </w:r>
-      <w:hyperlink w:history="1" r:id="rIdtcwlhvl9ch0adkzfgl5zv">
+      <w:hyperlink w:history="1" r:id="rIdz7ax3wosf77phsv_mhesg">
         <w:r>
           <w:rPr>
             <w:rFonts w:ascii="Arial" w:cs="Arial" w:eastAsia="Arial" w:hAnsi="Arial"/>
@@ -108,7 +108,7 @@
         </w:rPr>
         <w:t xml:space="preserve">  ·  </w:t>
       </w:r>
-      <w:hyperlink w:history="1" r:id="rIdk2gienpvo61mkhfhtwna2">
+      <w:hyperlink w:history="1" r:id="rId-iuq3zgmnapsta-0te0yi">
         <w:r>
           <w:rPr>
             <w:rFonts w:ascii="Arial" w:cs="Arial" w:eastAsia="Arial" w:hAnsi="Arial"/>
@@ -129,7 +129,7 @@
         </w:rPr>
         <w:t xml:space="preserve">  ·  </w:t>
       </w:r>
-      <w:hyperlink w:history="1" r:id="rIdw1-itif_uqw9_kb-yqk7e">
+      <w:hyperlink w:history="1" r:id="rIdcrtmbfo6033cgtor_pvml">
         <w:r>
           <w:rPr>
             <w:rFonts w:ascii="Arial" w:cs="Arial" w:eastAsia="Arial" w:hAnsi="Arial"/>
@@ -815,7 +815,7 @@
           <w:sz w:val="17"/>
           <w:szCs w:val="17"/>
         </w:rPr>
-        <w:t xml:space="preserve">	Remote</w:t>
+        <w:t xml:space="preserve">	Onsite</w:t>
       </w:r>
     </w:p>
     <w:p>
@@ -961,7 +961,7 @@
         </w:rPr>
         <w:t xml:space="preserve">	</w:t>
       </w:r>
-      <w:hyperlink w:history="1" r:id="rIdnw3n9rad4k2y5x2mj2sdp">
+      <w:hyperlink w:history="1" r:id="rIddrj2g4bg8mwwof0mtlfxx">
         <w:r>
           <w:rPr>
             <w:rFonts w:ascii="Arial" w:cs="Arial" w:eastAsia="Arial" w:hAnsi="Arial"/>
@@ -1025,7 +1025,7 @@
         </w:rPr>
         <w:t xml:space="preserve">	</w:t>
       </w:r>
-      <w:hyperlink w:history="1" r:id="rIdbskqwl7hlvt1x1at3valb">
+      <w:hyperlink w:history="1" r:id="rIdbbbjd_q5wqik3rc36_bca">
         <w:r>
           <w:rPr>
             <w:rFonts w:ascii="Arial" w:cs="Arial" w:eastAsia="Arial" w:hAnsi="Arial"/>
@@ -1089,7 +1089,7 @@
         </w:rPr>
         <w:t xml:space="preserve">	</w:t>
       </w:r>
-      <w:hyperlink w:history="1" r:id="rIdl5z6hqj1as-r17b87rzjg">
+      <w:hyperlink w:history="1" r:id="rIdfecsyljaev-nqpnnitbpu">
         <w:r>
           <w:rPr>
             <w:rFonts w:ascii="Arial" w:cs="Arial" w:eastAsia="Arial" w:hAnsi="Arial"/>
@@ -1151,7 +1151,7 @@
       <w:pPr>
         <w:spacing w:after="40" w:line="240"/>
       </w:pPr>
-      <w:hyperlink w:history="1" r:id="rIdtg7fcktiiponqhrofqy5d">
+      <w:hyperlink w:history="1" r:id="rIdk-kw-pv9m9lwjqvbwf7dl">
         <w:r>
           <w:rPr>
             <w:rFonts w:ascii="Arial" w:cs="Arial" w:eastAsia="Arial" w:hAnsi="Arial"/>
@@ -1179,7 +1179,7 @@
       <w:pPr>
         <w:spacing w:after="40" w:line="240"/>
       </w:pPr>
-      <w:hyperlink w:history="1" r:id="rIdn98wqzuiczc9snsza6adg">
+      <w:hyperlink w:history="1" r:id="rIdkk9xpmbza_cnxvjfsmzxc">
         <w:r>
           <w:rPr>
             <w:rFonts w:ascii="Arial" w:cs="Arial" w:eastAsia="Arial" w:hAnsi="Arial"/>
@@ -1207,7 +1207,7 @@
       <w:pPr>
         <w:spacing w:after="40" w:line="240"/>
       </w:pPr>
-      <w:hyperlink w:history="1" r:id="rIdpaalr9fvv2eepa9lhfbx9">
+      <w:hyperlink w:history="1" r:id="rIdqrbdfriwwfokbhzpeivjf">
         <w:r>
           <w:rPr>
             <w:rFonts w:ascii="Arial" w:cs="Arial" w:eastAsia="Arial" w:hAnsi="Arial"/>
@@ -1276,7 +1276,7 @@
           <w:sz w:val="17"/>
           <w:szCs w:val="17"/>
         </w:rPr>
-        <w:t xml:space="preserve">	Nov 2022 – May 2026</w:t>
+        <w:t xml:space="preserve">	Nov 2018 – May 2022</w:t>
       </w:r>
     </w:p>
     <w:sectPr>

</xml_diff>

<commit_message>
Bump years to 5 and swap hero photo to new headshot
- Resume PDF + DOCX summary: '4+ years' → '5 years'
- Portfolio stats bar: 4+ → 5 Years Experience
- Portfolio About: 'Four-plus years' → 'Five years'
- OG image: 4+ chip → 5
- Hero photo + blog author bio: uzair-linkedin.jpeg → uzair-profile.png
  (cleaner, professionally lit headshot)
</commit_message>
<xml_diff>
--- a/public/uzair-saleem-resume.docx
+++ b/public/uzair-saleem-resume.docx
@@ -45,7 +45,7 @@
         </w:rPr>
         <w:t xml:space="preserve">Islamabad, Pakistan  ·  </w:t>
       </w:r>
-      <w:hyperlink w:history="1" r:id="rIdlbh99gkqafzjn07k9osod">
+      <w:hyperlink w:history="1" r:id="rIdimboumdrnfhuxpwzvhluf">
         <w:r>
           <w:rPr>
             <w:rFonts w:ascii="Arial" w:cs="Arial" w:eastAsia="Arial" w:hAnsi="Arial"/>
@@ -66,7 +66,7 @@
         </w:rPr>
         <w:t xml:space="preserve">  ·  </w:t>
       </w:r>
-      <w:hyperlink w:history="1" r:id="rIdgev8s-q4c_014mn7sm51z">
+      <w:hyperlink w:history="1" r:id="rIdwjfbn-itusof9kuzsqxwc">
         <w:r>
           <w:rPr>
             <w:rFonts w:ascii="Arial" w:cs="Arial" w:eastAsia="Arial" w:hAnsi="Arial"/>
@@ -87,7 +87,7 @@
         </w:rPr>
         <w:t xml:space="preserve">  ·  </w:t>
       </w:r>
-      <w:hyperlink w:history="1" r:id="rIdz7ax3wosf77phsv_mhesg">
+      <w:hyperlink w:history="1" r:id="rIdu30io1nhaemubghcfzze6">
         <w:r>
           <w:rPr>
             <w:rFonts w:ascii="Arial" w:cs="Arial" w:eastAsia="Arial" w:hAnsi="Arial"/>
@@ -108,7 +108,7 @@
         </w:rPr>
         <w:t xml:space="preserve">  ·  </w:t>
       </w:r>
-      <w:hyperlink w:history="1" r:id="rId-iuq3zgmnapsta-0te0yi">
+      <w:hyperlink w:history="1" r:id="rIdcpunswmrvx6c3xi7xiubl">
         <w:r>
           <w:rPr>
             <w:rFonts w:ascii="Arial" w:cs="Arial" w:eastAsia="Arial" w:hAnsi="Arial"/>
@@ -129,7 +129,7 @@
         </w:rPr>
         <w:t xml:space="preserve">  ·  </w:t>
       </w:r>
-      <w:hyperlink w:history="1" r:id="rIdcrtmbfo6033cgtor_pvml">
+      <w:hyperlink w:history="1" r:id="rIdul-91ooa0m1mx2ryyyor5">
         <w:r>
           <w:rPr>
             <w:rFonts w:ascii="Arial" w:cs="Arial" w:eastAsia="Arial" w:hAnsi="Arial"/>
@@ -173,7 +173,7 @@
           <w:sz w:val="18"/>
           <w:szCs w:val="18"/>
         </w:rPr>
-        <w:t xml:space="preserve">Senior Full-Stack Engineer with 4+ years shipping production SaaS end-to-end — frontend, backend, infra, and AI-powered features. Shipped three production SaaS products solo for founder clients in the US, EU, and MENA. Holding a high bar for correctness: integer-cent money handling, idempotent webhooks, parity-first migrations.</w:t>
+        <w:t xml:space="preserve">Senior Full-Stack Engineer with 5 years shipping production SaaS end-to-end — frontend, backend, infra, and AI-powered features. Shipped three production SaaS products solo for founder clients in the US, EU, and MENA. Holding a high bar for correctness: integer-cent money handling, idempotent webhooks, parity-first migrations.</w:t>
       </w:r>
     </w:p>
     <w:p>
@@ -961,7 +961,7 @@
         </w:rPr>
         <w:t xml:space="preserve">	</w:t>
       </w:r>
-      <w:hyperlink w:history="1" r:id="rIddrj2g4bg8mwwof0mtlfxx">
+      <w:hyperlink w:history="1" r:id="rIdssytwp5u7yoceik4msyx4">
         <w:r>
           <w:rPr>
             <w:rFonts w:ascii="Arial" w:cs="Arial" w:eastAsia="Arial" w:hAnsi="Arial"/>
@@ -1025,7 +1025,7 @@
         </w:rPr>
         <w:t xml:space="preserve">	</w:t>
       </w:r>
-      <w:hyperlink w:history="1" r:id="rIdbbbjd_q5wqik3rc36_bca">
+      <w:hyperlink w:history="1" r:id="rId2bxmhbetv_yid_qcuookl">
         <w:r>
           <w:rPr>
             <w:rFonts w:ascii="Arial" w:cs="Arial" w:eastAsia="Arial" w:hAnsi="Arial"/>
@@ -1089,7 +1089,7 @@
         </w:rPr>
         <w:t xml:space="preserve">	</w:t>
       </w:r>
-      <w:hyperlink w:history="1" r:id="rIdfecsyljaev-nqpnnitbpu">
+      <w:hyperlink w:history="1" r:id="rId8wrf9_txg2fa42tj1tkky">
         <w:r>
           <w:rPr>
             <w:rFonts w:ascii="Arial" w:cs="Arial" w:eastAsia="Arial" w:hAnsi="Arial"/>
@@ -1151,7 +1151,7 @@
       <w:pPr>
         <w:spacing w:after="40" w:line="240"/>
       </w:pPr>
-      <w:hyperlink w:history="1" r:id="rIdk-kw-pv9m9lwjqvbwf7dl">
+      <w:hyperlink w:history="1" r:id="rIdtfvng41os01cq_vbvqigi">
         <w:r>
           <w:rPr>
             <w:rFonts w:ascii="Arial" w:cs="Arial" w:eastAsia="Arial" w:hAnsi="Arial"/>
@@ -1179,7 +1179,7 @@
       <w:pPr>
         <w:spacing w:after="40" w:line="240"/>
       </w:pPr>
-      <w:hyperlink w:history="1" r:id="rIdkk9xpmbza_cnxvjfsmzxc">
+      <w:hyperlink w:history="1" r:id="rIdfxhivdmvbvhh3ksmg3nzx">
         <w:r>
           <w:rPr>
             <w:rFonts w:ascii="Arial" w:cs="Arial" w:eastAsia="Arial" w:hAnsi="Arial"/>
@@ -1207,7 +1207,7 @@
       <w:pPr>
         <w:spacing w:after="40" w:line="240"/>
       </w:pPr>
-      <w:hyperlink w:history="1" r:id="rIdqrbdfriwwfokbhzpeivjf">
+      <w:hyperlink w:history="1" r:id="rIdhparchqkargenp7gox3qo">
         <w:r>
           <w:rPr>
             <w:rFonts w:ascii="Arial" w:cs="Arial" w:eastAsia="Arial" w:hAnsi="Arial"/>

</xml_diff>

<commit_message>
Resume: replace Summary with user-supplied paragraph (fintech/analytics/marketplaces/ops framing)
</commit_message>
<xml_diff>
--- a/public/uzair-saleem-resume.docx
+++ b/public/uzair-saleem-resume.docx
@@ -45,7 +45,7 @@
         </w:rPr>
         <w:t xml:space="preserve">Islamabad, Pakistan  ·  </w:t>
       </w:r>
-      <w:hyperlink w:history="1" r:id="rIdkzpsjl95gqam5-uolgn5p">
+      <w:hyperlink w:history="1" r:id="rIdtq-qayl-4xsmixjkkryvl">
         <w:r>
           <w:rPr>
             <w:rFonts w:ascii="Arial" w:cs="Arial" w:eastAsia="Arial" w:hAnsi="Arial"/>
@@ -66,7 +66,7 @@
         </w:rPr>
         <w:t xml:space="preserve">  ·  </w:t>
       </w:r>
-      <w:hyperlink w:history="1" r:id="rId-gf2uxqt_vrusgl_66q4s">
+      <w:hyperlink w:history="1" r:id="rId7aggs3rbtvehagqmrmnbt">
         <w:r>
           <w:rPr>
             <w:rFonts w:ascii="Arial" w:cs="Arial" w:eastAsia="Arial" w:hAnsi="Arial"/>
@@ -87,7 +87,7 @@
         </w:rPr>
         <w:t xml:space="preserve">  ·  </w:t>
       </w:r>
-      <w:hyperlink w:history="1" r:id="rId1bm41ezw6rjrqcxemt9ql">
+      <w:hyperlink w:history="1" r:id="rIdziveddyfxdtmikg5btogc">
         <w:r>
           <w:rPr>
             <w:rFonts w:ascii="Arial" w:cs="Arial" w:eastAsia="Arial" w:hAnsi="Arial"/>
@@ -108,7 +108,7 @@
         </w:rPr>
         <w:t xml:space="preserve">  ·  </w:t>
       </w:r>
-      <w:hyperlink w:history="1" r:id="rIdif-x-3pxhlqdm23lwk2vz">
+      <w:hyperlink w:history="1" r:id="rIdcoj8uakyl46sazxrckxkn">
         <w:r>
           <w:rPr>
             <w:rFonts w:ascii="Arial" w:cs="Arial" w:eastAsia="Arial" w:hAnsi="Arial"/>
@@ -129,7 +129,7 @@
         </w:rPr>
         <w:t xml:space="preserve">  ·  </w:t>
       </w:r>
-      <w:hyperlink w:history="1" r:id="rIdg02kaxgaotajzac9kj77q">
+      <w:hyperlink w:history="1" r:id="rIdq8g4v07bgwxop7e_1a6cu">
         <w:r>
           <w:rPr>
             <w:rFonts w:ascii="Arial" w:cs="Arial" w:eastAsia="Arial" w:hAnsi="Arial"/>
@@ -173,147 +173,7 @@
           <w:sz w:val="18"/>
           <w:szCs w:val="18"/>
         </w:rPr>
-        <w:t xml:space="preserve">Senior Full-Stack Engineer, </w:t>
-      </w:r>
-      <w:r>
-        <w:rPr>
-          <w:rFonts w:ascii="Arial" w:cs="Arial" w:eastAsia="Arial" w:hAnsi="Arial"/>
-          <w:b/>
-          <w:bCs/>
-          <w:color w:val="0E0D0B"/>
-          <w:sz w:val="18"/>
-          <w:szCs w:val="18"/>
-        </w:rPr>
-        <w:t xml:space="preserve">5 years</w:t>
-      </w:r>
-      <w:r>
-        <w:rPr>
-          <w:rFonts w:ascii="Arial" w:cs="Arial" w:eastAsia="Arial" w:hAnsi="Arial"/>
-          <w:color w:val="0E0D0B"/>
-          <w:sz w:val="18"/>
-          <w:szCs w:val="18"/>
-        </w:rPr>
-        <w:t xml:space="preserve"> shipping production SaaS end-to-end. Lead engineer at Rocket Devs on </w:t>
-      </w:r>
-      <w:r>
-        <w:rPr>
-          <w:rFonts w:ascii="Arial" w:cs="Arial" w:eastAsia="Arial" w:hAnsi="Arial"/>
-          <w:b/>
-          <w:bCs/>
-          <w:color w:val="0E0D0B"/>
-          <w:sz w:val="18"/>
-          <w:szCs w:val="18"/>
-        </w:rPr>
-        <w:t xml:space="preserve">Indiecator</w:t>
-      </w:r>
-      <w:r>
-        <w:rPr>
-          <w:rFonts w:ascii="Arial" w:cs="Arial" w:eastAsia="Arial" w:hAnsi="Arial"/>
-          <w:color w:val="0E0D0B"/>
-          <w:sz w:val="18"/>
-          <w:szCs w:val="18"/>
-        </w:rPr>
-        <w:t xml:space="preserve"> (Stripe Connect revenue analytics, ~3 months) and </w:t>
-      </w:r>
-      <w:r>
-        <w:rPr>
-          <w:rFonts w:ascii="Arial" w:cs="Arial" w:eastAsia="Arial" w:hAnsi="Arial"/>
-          <w:b/>
-          <w:bCs/>
-          <w:color w:val="0E0D0B"/>
-          <w:sz w:val="18"/>
-          <w:szCs w:val="18"/>
-        </w:rPr>
-        <w:t xml:space="preserve">Sat-Raj</w:t>
-      </w:r>
-      <w:r>
-        <w:rPr>
-          <w:rFonts w:ascii="Arial" w:cs="Arial" w:eastAsia="Arial" w:hAnsi="Arial"/>
-          <w:color w:val="0E0D0B"/>
-          <w:sz w:val="18"/>
-          <w:szCs w:val="18"/>
-        </w:rPr>
-        <w:t xml:space="preserve"> (NJ fuel distribution ops — replaced a daily </w:t>
-      </w:r>
-      <w:r>
-        <w:rPr>
-          <w:rFonts w:ascii="Arial" w:cs="Arial" w:eastAsia="Arial" w:hAnsi="Arial"/>
-          <w:b/>
-          <w:bCs/>
-          <w:color w:val="0E0D0B"/>
-          <w:sz w:val="18"/>
-          <w:szCs w:val="18"/>
-        </w:rPr>
-        <w:t xml:space="preserve">45–60 minute manual workflow</w:t>
-      </w:r>
-      <w:r>
-        <w:rPr>
-          <w:rFonts w:ascii="Arial" w:cs="Arial" w:eastAsia="Arial" w:hAnsi="Arial"/>
-          <w:color w:val="0E0D0B"/>
-          <w:sz w:val="18"/>
-          <w:szCs w:val="18"/>
-        </w:rPr>
-        <w:t xml:space="preserve"> with software that finishes in </w:t>
-      </w:r>
-      <w:r>
-        <w:rPr>
-          <w:rFonts w:ascii="Arial" w:cs="Arial" w:eastAsia="Arial" w:hAnsi="Arial"/>
-          <w:b/>
-          <w:bCs/>
-          <w:color w:val="0E0D0B"/>
-          <w:sz w:val="18"/>
-          <w:szCs w:val="18"/>
-        </w:rPr>
-        <w:t xml:space="preserve">under 90 seconds</w:t>
-      </w:r>
-      <w:r>
-        <w:rPr>
-          <w:rFonts w:ascii="Arial" w:cs="Arial" w:eastAsia="Arial" w:hAnsi="Arial"/>
-          <w:color w:val="0E0D0B"/>
-          <w:sz w:val="18"/>
-          <w:szCs w:val="18"/>
-        </w:rPr>
-        <w:t xml:space="preserve">). Promoted Junior to Senior at Apifiny in 18 months while shipping </w:t>
-      </w:r>
-      <w:r>
-        <w:rPr>
-          <w:rFonts w:ascii="Arial" w:cs="Arial" w:eastAsia="Arial" w:hAnsi="Arial"/>
-          <w:b/>
-          <w:bCs/>
-          <w:color w:val="0E0D0B"/>
-          <w:sz w:val="18"/>
-          <w:szCs w:val="18"/>
-        </w:rPr>
-        <w:t xml:space="preserve">Diffed.gg</w:t>
-      </w:r>
-      <w:r>
-        <w:rPr>
-          <w:rFonts w:ascii="Arial" w:cs="Arial" w:eastAsia="Arial" w:hAnsi="Arial"/>
-          <w:color w:val="0E0D0B"/>
-          <w:sz w:val="18"/>
-          <w:szCs w:val="18"/>
-        </w:rPr>
-        <w:t xml:space="preserve"> (3-sided gaming marketplace) end-to-end in </w:t>
-      </w:r>
-      <w:r>
-        <w:rPr>
-          <w:rFonts w:ascii="Arial" w:cs="Arial" w:eastAsia="Arial" w:hAnsi="Arial"/>
-          <w:b/>
-          <w:bCs/>
-          <w:color w:val="0E0D0B"/>
-          <w:sz w:val="18"/>
-          <w:szCs w:val="18"/>
-        </w:rPr>
-        <w:t xml:space="preserve">2 months</w:t>
-      </w:r>
-      <w:r>
-        <w:rPr>
-          <w:rFonts w:ascii="Arial" w:cs="Arial" w:eastAsia="Arial" w:hAnsi="Arial"/>
-          <w:color w:val="0E0D0B"/>
-          <w:sz w:val="18"/>
-          <w:szCs w:val="18"/>
-        </w:rPr>
-        <w:t xml:space="preserve"> on a 3-person team. Stack: Next.js, Node.js, Express, PostgreSQL, Supabase, Redis, Stripe, AWS.</w:t>
+        <w:t xml:space="preserve">Senior Full-Stack Engineer with 5 years building production SaaS platforms end-to-end across fintech, analytics, marketplaces, and operations software. Experienced leading architecture, backend systems, and cross-functional delivery for founder-led startups. Strong focus on Next.js, Node.js, PostgreSQL, Stripe, and scalable product infrastructure.</w:t>
       </w:r>
     </w:p>
     <w:p>
@@ -1235,7 +1095,7 @@
         </w:rPr>
         <w:t xml:space="preserve">	</w:t>
       </w:r>
-      <w:hyperlink w:history="1" r:id="rIdlpa7ofreatua2owactpoa">
+      <w:hyperlink w:history="1" r:id="rIdk76mtwvby1e_ftdqgulau">
         <w:r>
           <w:rPr>
             <w:rFonts w:ascii="Arial" w:cs="Arial" w:eastAsia="Arial" w:hAnsi="Arial"/>
@@ -1402,7 +1262,7 @@
         </w:rPr>
         <w:t xml:space="preserve">	</w:t>
       </w:r>
-      <w:hyperlink w:history="1" r:id="rIdu1ljghnhex0z3gtzg_33r">
+      <w:hyperlink w:history="1" r:id="rIdbjuajkln2wjp-wakzhjvb">
         <w:r>
           <w:rPr>
             <w:rFonts w:ascii="Arial" w:cs="Arial" w:eastAsia="Arial" w:hAnsi="Arial"/>
@@ -1588,7 +1448,7 @@
         </w:rPr>
         <w:t xml:space="preserve">	</w:t>
       </w:r>
-      <w:hyperlink w:history="1" r:id="rIdsxafv1nxqevsdwln_w5nn">
+      <w:hyperlink w:history="1" r:id="rIdg-qamzbosuszjta5ucsld">
         <w:r>
           <w:rPr>
             <w:rFonts w:ascii="Arial" w:cs="Arial" w:eastAsia="Arial" w:hAnsi="Arial"/>

</xml_diff>

<commit_message>
Regenerate DOCX resume to match new PDF voice rules
DOCX was stale relative to the CLAUDE.md voice-rule rewrite in 964a2d8.
Both PDF and DOCX now regenerate to public/ directly, no worktree path.

Co-Authored-By: Claude Opus 4.7 (1M context) <noreply@anthropic.com>
</commit_message>
<xml_diff>
--- a/public/uzair-saleem-resume.docx
+++ b/public/uzair-saleem-resume.docx
@@ -45,7 +45,7 @@
         </w:rPr>
         <w:t xml:space="preserve">Islamabad, Pakistan  ·  </w:t>
       </w:r>
-      <w:hyperlink w:history="1" r:id="rId6qewc4mnrtzjzwqtjw1hj">
+      <w:hyperlink w:history="1" r:id="rId91yfupyvx1vgakieghbjm">
         <w:r>
           <w:rPr>
             <w:rFonts w:ascii="Arial" w:cs="Arial" w:eastAsia="Arial" w:hAnsi="Arial"/>
@@ -66,7 +66,7 @@
         </w:rPr>
         <w:t xml:space="preserve">  ·  </w:t>
       </w:r>
-      <w:hyperlink w:history="1" r:id="rIdh0mpizi4lmxvepvwaw21c">
+      <w:hyperlink w:history="1" r:id="rIdgn-zjt8cqclqeubc5ohou">
         <w:r>
           <w:rPr>
             <w:rFonts w:ascii="Arial" w:cs="Arial" w:eastAsia="Arial" w:hAnsi="Arial"/>
@@ -87,7 +87,7 @@
         </w:rPr>
         <w:t xml:space="preserve">  ·  </w:t>
       </w:r>
-      <w:hyperlink w:history="1" r:id="rIdlisiirh4nwyody1wmopnp">
+      <w:hyperlink w:history="1" r:id="rIdtxo-uqmhcopillfkggfny">
         <w:r>
           <w:rPr>
             <w:rFonts w:ascii="Arial" w:cs="Arial" w:eastAsia="Arial" w:hAnsi="Arial"/>
@@ -108,7 +108,7 @@
         </w:rPr>
         <w:t xml:space="preserve">  ·  </w:t>
       </w:r>
-      <w:hyperlink w:history="1" r:id="rIdl0fvfrwi5kwlu930csw0y">
+      <w:hyperlink w:history="1" r:id="rIdt_-q8h2iyd9crrbwohypo">
         <w:r>
           <w:rPr>
             <w:rFonts w:ascii="Arial" w:cs="Arial" w:eastAsia="Arial" w:hAnsi="Arial"/>
@@ -129,7 +129,7 @@
         </w:rPr>
         <w:t xml:space="preserve">  ·  </w:t>
       </w:r>
-      <w:hyperlink w:history="1" r:id="rIdrf_aorwgiowwicuum1wgy">
+      <w:hyperlink w:history="1" r:id="rIdxin1dqzddubox8mesrqfi">
         <w:r>
           <w:rPr>
             <w:rFonts w:ascii="Arial" w:cs="Arial" w:eastAsia="Arial" w:hAnsi="Arial"/>
@@ -173,7 +173,47 @@
           <w:sz w:val="18"/>
           <w:szCs w:val="18"/>
         </w:rPr>
-        <w:t xml:space="preserve">Senior Full-Stack Engineer with 5 years building production SaaS platforms end-to-end across fintech, analytics, marketplaces, and operations software. Experienced leading architecture, backend systems, and cross-functional delivery for founder-led startups. Strong focus on Next.js, Node.js, PostgreSQL, Stripe, and scalable product infrastructure.</w:t>
+        <w:t xml:space="preserve">Senior full-stack engineer, 5 years shipping production SaaS end-to-end on Next.js, Node.js, PostgreSQL, and Supabase. Lead engineer at Rocket Devs on two founder-client builds: </w:t>
+      </w:r>
+      <w:r>
+        <w:rPr>
+          <w:rFonts w:ascii="Arial" w:cs="Arial" w:eastAsia="Arial" w:hAnsi="Arial"/>
+          <w:b/>
+          <w:bCs/>
+          <w:color w:val="0E0D0B"/>
+          <w:sz w:val="18"/>
+          <w:szCs w:val="18"/>
+        </w:rPr>
+        <w:t xml:space="preserve">Indiecator</w:t>
+      </w:r>
+      <w:r>
+        <w:rPr>
+          <w:rFonts w:ascii="Arial" w:cs="Arial" w:eastAsia="Arial" w:hAnsi="Arial"/>
+          <w:color w:val="0E0D0B"/>
+          <w:sz w:val="18"/>
+          <w:szCs w:val="18"/>
+        </w:rPr>
+        <w:t xml:space="preserve"> (Stripe Connect revenue analytics with a hybrid invoice + event MRR ledger) and </w:t>
+      </w:r>
+      <w:r>
+        <w:rPr>
+          <w:rFonts w:ascii="Arial" w:cs="Arial" w:eastAsia="Arial" w:hAnsi="Arial"/>
+          <w:b/>
+          <w:bCs/>
+          <w:color w:val="0E0D0B"/>
+          <w:sz w:val="18"/>
+          <w:szCs w:val="18"/>
+        </w:rPr>
+        <w:t xml:space="preserve">Sat-Raj</w:t>
+      </w:r>
+      <w:r>
+        <w:rPr>
+          <w:rFonts w:ascii="Arial" w:cs="Arial" w:eastAsia="Arial" w:hAnsi="Arial"/>
+          <w:color w:val="0E0D0B"/>
+          <w:sz w:val="18"/>
+          <w:szCs w:val="18"/>
+        </w:rPr>
+        <w:t xml:space="preserve"> (operations platform that replaced 39 spreadsheets for a 30-year US fuel wholesaler). Promoted Junior → Senior at Apifiny in 18 months on a 3-person agency team. AI-assisted development (Claude Code, agentic workflows) is part of how I ship daily.</w:t>
       </w:r>
     </w:p>
     <w:p>
@@ -218,7 +258,7 @@
           <w:sz w:val="18"/>
           <w:szCs w:val="18"/>
         </w:rPr>
-        <w:t xml:space="preserve">TypeScript, JavaScript, SQL</w:t>
+        <w:t xml:space="preserve">TypeScript, JavaScript, Python, SQL</w:t>
       </w:r>
     </w:p>
     <w:p>
@@ -243,7 +283,7 @@
           <w:sz w:val="18"/>
           <w:szCs w:val="18"/>
         </w:rPr>
-        <w:t xml:space="preserve">Next.js (App Router), React, Tailwind CSS, Shadcn UI, Framer Motion, Responsive Design</w:t>
+        <w:t xml:space="preserve">Next.js (App Router), React, Tailwind CSS, Shadcn UI, Framer Motion</w:t>
       </w:r>
     </w:p>
     <w:p>
@@ -268,7 +308,7 @@
           <w:sz w:val="18"/>
           <w:szCs w:val="18"/>
         </w:rPr>
-        <w:t xml:space="preserve">Node.js, Express.js, Prisma, REST APIs, Webhooks, Socket.IO, OAuth, JWT Authentication</w:t>
+        <w:t xml:space="preserve">Node.js, Express.js, Prisma, REST APIs, Webhooks, Socket.IO, OAuth, JWT</w:t>
       </w:r>
     </w:p>
     <w:p>
@@ -293,7 +333,7 @@
           <w:sz w:val="18"/>
           <w:szCs w:val="18"/>
         </w:rPr>
-        <w:t xml:space="preserve">PostgreSQL, Supabase (RLS), Redis, MongoDB, Database Design, Schema Design, Migrations</w:t>
+        <w:t xml:space="preserve">PostgreSQL, Supabase (Row-Level Security), Redis, MongoDB</w:t>
       </w:r>
     </w:p>
     <w:p>
@@ -318,7 +358,7 @@
           <w:sz w:val="18"/>
           <w:szCs w:val="18"/>
         </w:rPr>
-        <w:t xml:space="preserve">Stripe, Stripe Connect, Paddle, PayPal, Multi-Currency Systems, Samsara API, QuickBooks</w:t>
+        <w:t xml:space="preserve">Stripe Connect, Paddle, PayPal, Multi-currency wallets, ECB FX, Samsara API, QuickBooks (.NET bridge)</w:t>
       </w:r>
     </w:p>
     <w:p>
@@ -463,7 +503,7 @@
           <w:sz w:val="18"/>
           <w:szCs w:val="18"/>
         </w:rPr>
-        <w:t xml:space="preserve">Lead engineer on </w:t>
+        <w:t xml:space="preserve">Lead engineer on two founder-client builds: </w:t>
       </w:r>
       <w:r>
         <w:rPr>
@@ -483,7 +523,7 @@
           <w:sz w:val="18"/>
           <w:szCs w:val="18"/>
         </w:rPr>
-        <w:t xml:space="preserve">, a Stripe Connect revenue analytics platform, and </w:t>
+        <w:t xml:space="preserve"> (Stripe Connect revenue analytics) and </w:t>
       </w:r>
       <w:r>
         <w:rPr>
@@ -503,7 +543,7 @@
           <w:sz w:val="18"/>
           <w:szCs w:val="18"/>
         </w:rPr>
-        <w:t xml:space="preserve">, an operations platform for a 30-year-old US fuel wholesaler.</w:t>
+        <w:t xml:space="preserve"> (operations platform for a 30-year US fuel wholesaler).</w:t>
       </w:r>
     </w:p>
     <w:p>
@@ -522,7 +562,7 @@
           <w:sz w:val="18"/>
           <w:szCs w:val="18"/>
         </w:rPr>
-        <w:t xml:space="preserve">Designed and shipped the architecture, database schema, backend systems, and deployment infrastructure for both products end-to-end.</w:t>
+        <w:t xml:space="preserve">Shipped Indiecator end-to-end in ~3 months on a 3-person team: multi-tenant Postgres with Supabase row-level security, three idempotent ingestion flows (live webhooks, 24-hour catch-up cron on GitHub Actions, 2-year historical backfill) feeding one ledger.</w:t>
       </w:r>
     </w:p>
     <w:p>
@@ -541,7 +581,7 @@
           <w:sz w:val="18"/>
           <w:szCs w:val="18"/>
         </w:rPr>
-        <w:t xml:space="preserve">Built a multi-tenant analytics ingestion pipeline combining Stripe/Paddle webhooks, reconciliation jobs, and historical backfills into a Postgres ledger secured with Supabase RLS.</w:t>
+        <w:t xml:space="preserve">Solved Stripe's 3-month event retention limit by anchoring historical MRR to invoice data while keeping the event path live for real-time changes — both writing to the same ledger keys for deterministic reconciliation.</w:t>
       </w:r>
     </w:p>
     <w:p>
@@ -560,18 +600,96 @@
           <w:sz w:val="18"/>
           <w:szCs w:val="18"/>
         </w:rPr>
-        <w:t xml:space="preserve">Replaced a spreadsheet-driven operational workflow at Sat-Raj, reducing daily pricing, invoicing, and customer-email processing from </w:t>
-      </w:r>
-      <w:r>
-        <w:rPr>
-          <w:rFonts w:ascii="Arial" w:cs="Arial" w:eastAsia="Arial" w:hAnsi="Arial"/>
-          <w:b/>
-          <w:bCs/>
-          <w:color w:val="0E0D0B"/>
-          <w:sz w:val="18"/>
-          <w:szCs w:val="18"/>
-        </w:rPr>
-        <w:t xml:space="preserve">45–60 minutes to under 90 seconds</w:t>
+        <w:t xml:space="preserve">Built per-day historical FX service against ECB rates across 30 display currencies (so historical charts don't shift when today's rates move); Redis cache on hot dashboards; drill-down from every metric to the underlying Stripe/Paddle object.</w:t>
+      </w:r>
+    </w:p>
+    <w:p>
+      <w:pPr>
+        <w:pStyle w:val="ListParagraph"/>
+        <w:numPr>
+          <w:ilvl w:val="0"/>
+          <w:numId w:val="2"/>
+        </w:numPr>
+        <w:spacing w:after="30" w:line="250"/>
+      </w:pPr>
+      <w:r>
+        <w:rPr>
+          <w:rFonts w:ascii="Arial" w:cs="Arial" w:eastAsia="Arial" w:hAnsi="Arial"/>
+          <w:color w:val="0E0D0B"/>
+          <w:sz w:val="18"/>
+          <w:szCs w:val="18"/>
+        </w:rPr>
+        <w:t xml:space="preserve">Replaced </w:t>
+      </w:r>
+      <w:r>
+        <w:rPr>
+          <w:rFonts w:ascii="Arial" w:cs="Arial" w:eastAsia="Arial" w:hAnsi="Arial"/>
+          <w:b/>
+          <w:bCs/>
+          <w:color w:val="0E0D0B"/>
+          <w:sz w:val="18"/>
+          <w:szCs w:val="18"/>
+        </w:rPr>
+        <w:t xml:space="preserve">39 hand-edited spreadsheets</w:t>
+      </w:r>
+      <w:r>
+        <w:rPr>
+          <w:rFonts w:ascii="Arial" w:cs="Arial" w:eastAsia="Arial" w:hAnsi="Arial"/>
+          <w:color w:val="0E0D0B"/>
+          <w:sz w:val="18"/>
+          <w:szCs w:val="18"/>
+        </w:rPr>
+        <w:t xml:space="preserve"> at Sat-Raj with a unified ops platform — daily processing dropped from </w:t>
+      </w:r>
+      <w:r>
+        <w:rPr>
+          <w:rFonts w:ascii="Arial" w:cs="Arial" w:eastAsia="Arial" w:hAnsi="Arial"/>
+          <w:b/>
+          <w:bCs/>
+          <w:color w:val="0E0D0B"/>
+          <w:sz w:val="18"/>
+          <w:szCs w:val="18"/>
+        </w:rPr>
+        <w:t xml:space="preserve">45–60 min to under 90 sec</w:t>
+      </w:r>
+      <w:r>
+        <w:rPr>
+          <w:rFonts w:ascii="Arial" w:cs="Arial" w:eastAsia="Arial" w:hAnsi="Arial"/>
+          <w:color w:val="0E0D0B"/>
+          <w:sz w:val="18"/>
+          <w:szCs w:val="18"/>
+        </w:rPr>
+        <w:t xml:space="preserve">. Built 3-gate address mapping (dispatch dropdowns → pre-filled driver forms → Samsara geofence fallback) after free-text driver addresses broke invoice routing.</w:t>
+      </w:r>
+    </w:p>
+    <w:p>
+      <w:pPr>
+        <w:pStyle w:val="ListParagraph"/>
+        <w:numPr>
+          <w:ilvl w:val="0"/>
+          <w:numId w:val="2"/>
+        </w:numPr>
+        <w:spacing w:after="30" w:line="250"/>
+      </w:pPr>
+      <w:r>
+        <w:rPr>
+          <w:rFonts w:ascii="Arial" w:cs="Arial" w:eastAsia="Arial" w:hAnsi="Arial"/>
+          <w:color w:val="0E0D0B"/>
+          <w:sz w:val="18"/>
+          <w:szCs w:val="18"/>
+        </w:rPr>
+        <w:t xml:space="preserve">Built reconciliation engine across Samsara API and supplier FTP with idempotent 3-hour background jobs; .NET bridge pushes invoices from the web app to QuickBooks on the ops team's on-prem machine. Mentored </w:t>
+      </w:r>
+      <w:r>
+        <w:rPr>
+          <w:rFonts w:ascii="Arial" w:cs="Arial" w:eastAsia="Arial" w:hAnsi="Arial"/>
+          <w:b/>
+          <w:bCs/>
+          <w:color w:val="0E0D0B"/>
+          <w:sz w:val="18"/>
+          <w:szCs w:val="18"/>
+        </w:rPr>
+        <w:t xml:space="preserve">2 junior developers</w:t>
       </w:r>
       <w:r>
         <w:rPr>
@@ -581,64 +699,6 @@
           <w:szCs w:val="18"/>
         </w:rPr>
         <w:t xml:space="preserve">.</w:t>
-      </w:r>
-    </w:p>
-    <w:p>
-      <w:pPr>
-        <w:pStyle w:val="ListParagraph"/>
-        <w:numPr>
-          <w:ilvl w:val="0"/>
-          <w:numId w:val="2"/>
-        </w:numPr>
-        <w:spacing w:after="30" w:line="250"/>
-      </w:pPr>
-      <w:r>
-        <w:rPr>
-          <w:rFonts w:ascii="Arial" w:cs="Arial" w:eastAsia="Arial" w:hAnsi="Arial"/>
-          <w:color w:val="0E0D0B"/>
-          <w:sz w:val="18"/>
-          <w:szCs w:val="18"/>
-        </w:rPr>
-        <w:t xml:space="preserve">Built reconciliation systems integrating Samsara telematics, supplier FTP data, and QuickBooks synchronization through idempotent background jobs.</w:t>
-      </w:r>
-    </w:p>
-    <w:p>
-      <w:pPr>
-        <w:pStyle w:val="ListParagraph"/>
-        <w:numPr>
-          <w:ilvl w:val="0"/>
-          <w:numId w:val="2"/>
-        </w:numPr>
-        <w:spacing w:after="30" w:line="250"/>
-      </w:pPr>
-      <w:r>
-        <w:rPr>
-          <w:rFonts w:ascii="Arial" w:cs="Arial" w:eastAsia="Arial" w:hAnsi="Arial"/>
-          <w:color w:val="0E0D0B"/>
-          <w:sz w:val="18"/>
-          <w:szCs w:val="18"/>
-        </w:rPr>
-        <w:t xml:space="preserve">Led </w:t>
-      </w:r>
-      <w:r>
-        <w:rPr>
-          <w:rFonts w:ascii="Arial" w:cs="Arial" w:eastAsia="Arial" w:hAnsi="Arial"/>
-          <w:b/>
-          <w:bCs/>
-          <w:color w:val="0E0D0B"/>
-          <w:sz w:val="18"/>
-          <w:szCs w:val="18"/>
-        </w:rPr>
-        <w:t xml:space="preserve">2 junior developers</w:t>
-      </w:r>
-      <w:r>
-        <w:rPr>
-          <w:rFonts w:ascii="Arial" w:cs="Arial" w:eastAsia="Arial" w:hAnsi="Arial"/>
-          <w:color w:val="0E0D0B"/>
-          <w:sz w:val="18"/>
-          <w:szCs w:val="18"/>
-        </w:rPr>
-        <w:t xml:space="preserve"> and collaborated directly with founder clients on product scope, architecture, and delivery.</w:t>
       </w:r>
     </w:p>
     <w:p>
@@ -713,7 +773,7 @@
           <w:sz w:val="18"/>
           <w:szCs w:val="18"/>
         </w:rPr>
-        <w:t xml:space="preserve">Redesigned an AI video rendering pipeline, reducing render times from minutes to seconds across browsers and hardware configurations.</w:t>
+        <w:t xml:space="preserve">Built the AI Reel generator: upload clips → record one-line voice sample → cloned voice narrates an LLM-generated scene-aware script over user-selected scenes, with full clip and script editing before final render.</w:t>
       </w:r>
     </w:p>
     <w:p>
@@ -732,7 +792,27 @@
           <w:sz w:val="18"/>
           <w:szCs w:val="18"/>
         </w:rPr>
-        <w:t xml:space="preserve">Migrated rendering infrastructure from FFmpeg.wasm to MediaBunny after optimizing multithreaded browser rendering workflows.</w:t>
+        <w:t xml:space="preserve">Migrated rendering from FFmpeg.wasm to MediaBunny after browser-side renders ran 2–10 min with high device variance; new pipeline ~20 sec consistent across browsers — </w:t>
+      </w:r>
+      <w:r>
+        <w:rPr>
+          <w:rFonts w:ascii="Arial" w:cs="Arial" w:eastAsia="Arial" w:hAnsi="Arial"/>
+          <w:b/>
+          <w:bCs/>
+          <w:color w:val="0E0D0B"/>
+          <w:sz w:val="18"/>
+          <w:szCs w:val="18"/>
+        </w:rPr>
+        <w:t xml:space="preserve">~90% reduction</w:t>
+      </w:r>
+      <w:r>
+        <w:rPr>
+          <w:rFonts w:ascii="Arial" w:cs="Arial" w:eastAsia="Arial" w:hAnsi="Arial"/>
+          <w:color w:val="0E0D0B"/>
+          <w:sz w:val="18"/>
+          <w:szCs w:val="18"/>
+        </w:rPr>
+        <w:t xml:space="preserve">. Tried multithreaded FFmpeg.wasm first (10 min → 5 min) before researching community benchmarks on the alternative.</w:t>
       </w:r>
     </w:p>
     <w:p>
@@ -751,7 +831,27 @@
           <w:sz w:val="18"/>
           <w:szCs w:val="18"/>
         </w:rPr>
-        <w:t xml:space="preserve">Improved restaurant data scraping throughput by implementing parallelized Chromium automation pipelines.</w:t>
+        <w:t xml:space="preserve">Rebuilt the Germany restaurant scraping pipeline: converted sequential Chromium scraping to 5-way parallel batch with per-platform throttling for sites that blocked aggressive crawling — </w:t>
+      </w:r>
+      <w:r>
+        <w:rPr>
+          <w:rFonts w:ascii="Arial" w:cs="Arial" w:eastAsia="Arial" w:hAnsi="Arial"/>
+          <w:b/>
+          <w:bCs/>
+          <w:color w:val="0E0D0B"/>
+          <w:sz w:val="18"/>
+          <w:szCs w:val="18"/>
+        </w:rPr>
+        <w:t xml:space="preserve">~80% throughput improvement</w:t>
+      </w:r>
+      <w:r>
+        <w:rPr>
+          <w:rFonts w:ascii="Arial" w:cs="Arial" w:eastAsia="Arial" w:hAnsi="Arial"/>
+          <w:color w:val="0E0D0B"/>
+          <w:sz w:val="18"/>
+          <w:szCs w:val="18"/>
+        </w:rPr>
+        <w:t xml:space="preserve"> at zero infrastructure cost.</w:t>
       </w:r>
     </w:p>
     <w:p>
@@ -770,27 +870,46 @@
           <w:sz w:val="18"/>
           <w:szCs w:val="18"/>
         </w:rPr>
-        <w:t xml:space="preserve">Built logistics infrastructure for a German B2B marketplace, including ZIP-code mapping and shipping logic across </w:t>
-      </w:r>
-      <w:r>
-        <w:rPr>
-          <w:rFonts w:ascii="Arial" w:cs="Arial" w:eastAsia="Arial" w:hAnsi="Arial"/>
-          <w:b/>
-          <w:bCs/>
-          <w:color w:val="0E0D0B"/>
-          <w:sz w:val="18"/>
-          <w:szCs w:val="18"/>
-        </w:rPr>
-        <w:t xml:space="preserve">~12,000 regional entries</w:t>
-      </w:r>
-      <w:r>
-        <w:rPr>
-          <w:rFonts w:ascii="Arial" w:cs="Arial" w:eastAsia="Arial" w:hAnsi="Arial"/>
-          <w:color w:val="0E0D0B"/>
-          <w:sz w:val="18"/>
-          <w:szCs w:val="18"/>
-        </w:rPr>
-        <w:t xml:space="preserve">.</w:t>
+        <w:t xml:space="preserve">Shipped a B2B bulk-goods marketplace cart with Germany-specific multi-ZIP shipping rules; scraped and normalized </w:t>
+      </w:r>
+      <w:r>
+        <w:rPr>
+          <w:rFonts w:ascii="Arial" w:cs="Arial" w:eastAsia="Arial" w:hAnsi="Arial"/>
+          <w:b/>
+          <w:bCs/>
+          <w:color w:val="0E0D0B"/>
+          <w:sz w:val="18"/>
+          <w:szCs w:val="18"/>
+        </w:rPr>
+        <w:t xml:space="preserve">~12,000 ZIP-to-city-to-state mappings</w:t>
+      </w:r>
+      <w:r>
+        <w:rPr>
+          <w:rFonts w:ascii="Arial" w:cs="Arial" w:eastAsia="Arial" w:hAnsi="Arial"/>
+          <w:color w:val="0E0D0B"/>
+          <w:sz w:val="18"/>
+          <w:szCs w:val="18"/>
+        </w:rPr>
+        <w:t xml:space="preserve"> into Supabase to drive per-warehouse pricing.</w:t>
+      </w:r>
+    </w:p>
+    <w:p>
+      <w:pPr>
+        <w:pStyle w:val="ListParagraph"/>
+        <w:numPr>
+          <w:ilvl w:val="0"/>
+          <w:numId w:val="2"/>
+        </w:numPr>
+        <w:spacing w:after="30" w:line="250"/>
+      </w:pPr>
+      <w:r>
+        <w:rPr>
+          <w:rFonts w:ascii="Arial" w:cs="Arial" w:eastAsia="Arial" w:hAnsi="Arial"/>
+          <w:color w:val="0E0D0B"/>
+          <w:sz w:val="18"/>
+          <w:szCs w:val="18"/>
+        </w:rPr>
+        <w:t xml:space="preserve">Shipped the restaurant data dashboard UI with Framer Motion animations integrated against the live scraping API.</w:t>
       </w:r>
     </w:p>
     <w:p>
@@ -885,18 +1004,18 @@
           <w:sz w:val="18"/>
           <w:szCs w:val="18"/>
         </w:rPr>
-        <w:t xml:space="preserve">, a 3-sided gaming services marketplace, </w:t>
-      </w:r>
-      <w:r>
-        <w:rPr>
-          <w:rFonts w:ascii="Arial" w:cs="Arial" w:eastAsia="Arial" w:hAnsi="Arial"/>
-          <w:b/>
-          <w:bCs/>
-          <w:color w:val="0E0D0B"/>
-          <w:sz w:val="18"/>
-          <w:szCs w:val="18"/>
-        </w:rPr>
-        <w:t xml:space="preserve">end-to-end within 2 months</w:t>
+        <w:t xml:space="preserve"> — a 3-sided gaming services marketplace (player, expert, admin) — </w:t>
+      </w:r>
+      <w:r>
+        <w:rPr>
+          <w:rFonts w:ascii="Arial" w:cs="Arial" w:eastAsia="Arial" w:hAnsi="Arial"/>
+          <w:b/>
+          <w:bCs/>
+          <w:color w:val="0E0D0B"/>
+          <w:sz w:val="18"/>
+          <w:szCs w:val="18"/>
+        </w:rPr>
+        <w:t xml:space="preserve">end-to-end in 2 months</w:t>
       </w:r>
       <w:r>
         <w:rPr>
@@ -924,7 +1043,7 @@
           <w:sz w:val="18"/>
           <w:szCs w:val="18"/>
         </w:rPr>
-        <w:t xml:space="preserve">Built a configurable backend engine enabling admins to onboard new games and ranking systems without engineering involvement.</w:t>
+        <w:t xml:space="preserve">Built a configurable game-management engine: admins onboard new games, ranking systems, and reward structures from the admin panel with no backend code changes.</w:t>
       </w:r>
     </w:p>
     <w:p>
@@ -943,7 +1062,7 @@
           <w:sz w:val="18"/>
           <w:szCs w:val="18"/>
         </w:rPr>
-        <w:t xml:space="preserve">Designed a multi-currency wallet and settlement infrastructure using Stripe and PayPal integrations with historical FX-rate handling.</w:t>
+        <w:t xml:space="preserve">Solved cross-game ranking reconciliation across tiered systems (Iron/Gold/Diamond) and flat systems (Master/Grandmaster) so experts could be matched to players across heterogeneous games.</w:t>
       </w:r>
     </w:p>
     <w:p>
@@ -962,7 +1081,7 @@
           <w:sz w:val="18"/>
           <w:szCs w:val="18"/>
         </w:rPr>
-        <w:t xml:space="preserve">Implemented real-time order chat, OAuth authentication, fee-split workflows, and screenshot verification systems.</w:t>
+        <w:t xml:space="preserve">Built a multi-currency wallet engine: Stripe and PayPal payouts routed to in-platform wallets, with currency values stored at the rate of the day each transaction settled.</w:t>
       </w:r>
     </w:p>
     <w:p>
@@ -981,7 +1100,26 @@
           <w:sz w:val="18"/>
           <w:szCs w:val="18"/>
         </w:rPr>
-        <w:t xml:space="preserve">Led architecture, schema design, admin tooling, and mentorship of </w:t>
+        <w:t xml:space="preserve">Shipped Socket.IO real-time order chat, OAuth, JWT auth, fee-split workflows, screenshot verification, and admin moderation tooling.</w:t>
+      </w:r>
+    </w:p>
+    <w:p>
+      <w:pPr>
+        <w:pStyle w:val="ListParagraph"/>
+        <w:numPr>
+          <w:ilvl w:val="0"/>
+          <w:numId w:val="2"/>
+        </w:numPr>
+        <w:spacing w:after="30" w:line="250"/>
+      </w:pPr>
+      <w:r>
+        <w:rPr>
+          <w:rFonts w:ascii="Arial" w:cs="Arial" w:eastAsia="Arial" w:hAnsi="Arial"/>
+          <w:color w:val="0E0D0B"/>
+          <w:sz w:val="18"/>
+          <w:szCs w:val="18"/>
+        </w:rPr>
+        <w:t xml:space="preserve">Designed the full schema and system architecture across player, expert, and admin surfaces. Mentored </w:t>
       </w:r>
       <w:r>
         <w:rPr>
@@ -1078,16 +1216,16 @@
           <w:sz w:val="18"/>
           <w:szCs w:val="18"/>
         </w:rPr>
-        <w:t xml:space="preserve">Promoted from Junior Engineer to Senior Engineer within 18 months</w:t>
-      </w:r>
-      <w:r>
-        <w:rPr>
-          <w:rFonts w:ascii="Arial" w:cs="Arial" w:eastAsia="Arial" w:hAnsi="Arial"/>
-          <w:color w:val="0E0D0B"/>
-          <w:sz w:val="18"/>
-          <w:szCs w:val="18"/>
-        </w:rPr>
-        <w:t xml:space="preserve"> based on technical ownership and delivery impact.</w:t>
+        <w:t xml:space="preserve">Promoted Junior → Senior in 18 months</w:t>
+      </w:r>
+      <w:r>
+        <w:rPr>
+          <w:rFonts w:ascii="Arial" w:cs="Arial" w:eastAsia="Arial" w:hAnsi="Arial"/>
+          <w:color w:val="0E0D0B"/>
+          <w:sz w:val="18"/>
+          <w:szCs w:val="18"/>
+        </w:rPr>
+        <w:t xml:space="preserve"> based on delivery impact across multiple agency SaaS builds.</w:t>
       </w:r>
     </w:p>
     <w:p>
@@ -1106,26 +1244,7 @@
           <w:sz w:val="18"/>
           <w:szCs w:val="18"/>
         </w:rPr>
-        <w:t xml:space="preserve">Built features across multiple B2B SaaS products for agency clients across frontend, backend, and database systems.</w:t>
-      </w:r>
-    </w:p>
-    <w:p>
-      <w:pPr>
-        <w:pStyle w:val="ListParagraph"/>
-        <w:numPr>
-          <w:ilvl w:val="0"/>
-          <w:numId w:val="2"/>
-        </w:numPr>
-        <w:spacing w:after="30" w:line="250"/>
-      </w:pPr>
-      <w:r>
-        <w:rPr>
-          <w:rFonts w:ascii="Arial" w:cs="Arial" w:eastAsia="Arial" w:hAnsi="Arial"/>
-          <w:color w:val="0E0D0B"/>
-          <w:sz w:val="18"/>
-          <w:szCs w:val="18"/>
-        </w:rPr>
-        <w:t xml:space="preserve">Developed dashboards, APIs, and internal tooling while expanding into full-stack architecture responsibilities.</w:t>
+        <w:t xml:space="preserve">Shipped features across B2B SaaS products: frontend dashboards, backend APIs, schema design, and internal admin tooling. Expanded into full-stack architecture work that led directly into the Diffed.gg senior role.</w:t>
       </w:r>
     </w:p>
     <w:p>
@@ -1174,7 +1293,7 @@
         </w:rPr>
         <w:t xml:space="preserve">	</w:t>
       </w:r>
-      <w:hyperlink w:history="1" r:id="rIdsesmb5haz9xe6qbdzq863">
+      <w:hyperlink w:history="1" r:id="rIdizomfei6opubhvz7qqu5r">
         <w:r>
           <w:rPr>
             <w:rFonts w:ascii="Arial" w:cs="Arial" w:eastAsia="Arial" w:hAnsi="Arial"/>
@@ -1198,7 +1317,7 @@
           <w:sz w:val="18"/>
           <w:szCs w:val="18"/>
         </w:rPr>
-        <w:t xml:space="preserve">Baremetrics-style revenue analytics platform built on Stripe Connect for subscription businesses.</w:t>
+        <w:t xml:space="preserve">Baremetrics-style revenue analytics for indie SaaS founders running on Stripe Connect.</w:t>
       </w:r>
     </w:p>
     <w:p>
@@ -1217,7 +1336,7 @@
           <w:sz w:val="17"/>
           <w:szCs w:val="17"/>
         </w:rPr>
-        <w:t xml:space="preserve">Designed three parallel ingestion flows: live Stripe/Paddle webhooks, scheduled reconciliation jobs, and historical backfill pipelines feeding a multi-tenant Postgres ledger.</w:t>
+        <w:t xml:space="preserve">Three idempotent ingestion flows feeding one ledger: live webhooks, 24-hour catch-up cron on GitHub Actions, and 2-year historical backfill — all converging on the same row keys.</w:t>
       </w:r>
     </w:p>
     <w:p>
@@ -1236,7 +1355,7 @@
           <w:sz w:val="17"/>
           <w:szCs w:val="17"/>
         </w:rPr>
-        <w:t xml:space="preserve">Built an invoice and event-driven MRR system supporting prorations, subscription plan changes, and long-term analytics retention beyond Stripe's event window.</w:t>
+        <w:t xml:space="preserve">Hybrid invoice + event MRR engine: invoices anchor the historical backbone, events handle real-time changes. Stripe only retains 3 months of event history, so a pure-event approach would have broken backfills.</w:t>
       </w:r>
     </w:p>
     <w:p>
@@ -1255,7 +1374,7 @@
           <w:sz w:val="17"/>
           <w:szCs w:val="17"/>
         </w:rPr>
-        <w:t xml:space="preserve">Implemented per-day FX conversion across 30 display currencies using ECB exchange-rate data with Redis-cached analytics dashboards.</w:t>
+        <w:t xml:space="preserve">Per-day historical FX across 30 display currencies via ECB rates — historical revenue charts don't shift when today's rates move.</w:t>
       </w:r>
     </w:p>
     <w:p>
@@ -1274,7 +1393,7 @@
           <w:sz w:val="17"/>
           <w:szCs w:val="17"/>
         </w:rPr>
-        <w:t xml:space="preserve">Added drill-down reporting enabling direct traceability from aggregated metrics to source customer transactions.</w:t>
+        <w:t xml:space="preserve">Multi-tenant Postgres with row-level security via Supabase. Drill-down from every aggregated metric to the underlying Stripe/Paddle object. Redis cache on hot dashboards.</w:t>
       </w:r>
     </w:p>
     <w:p>
@@ -1291,7 +1410,7 @@
           <w:sz w:val="16"/>
           <w:szCs w:val="16"/>
         </w:rPr>
-        <w:t xml:space="preserve">· Next.js · Node.js · Express.js · Prisma · PostgreSQL · Supabase (RLS) · Stripe Connect · Paddle · Redis · GitHub Actions · Cloudflare</w:t>
+        <w:t xml:space="preserve">· Next.js · Node.js · TypeScript · PostgreSQL · Supabase (RLS) · Stripe Connect · Paddle · Redis · GitHub Actions · Cloudflare Pages</w:t>
       </w:r>
     </w:p>
     <w:p>
@@ -1320,7 +1439,7 @@
         </w:rPr>
         <w:t xml:space="preserve">	</w:t>
       </w:r>
-      <w:hyperlink w:history="1" r:id="rIdjdgzyzz9xkpl5nszd6vmj">
+      <w:hyperlink w:history="1" r:id="rIdohehxqnlggliug03caril">
         <w:r>
           <w:rPr>
             <w:rFonts w:ascii="Arial" w:cs="Arial" w:eastAsia="Arial" w:hAnsi="Arial"/>
@@ -1344,7 +1463,7 @@
           <w:sz w:val="18"/>
           <w:szCs w:val="18"/>
         </w:rPr>
-        <w:t xml:space="preserve">Three-sided gaming services marketplace supporting players, experts, and administrators.</w:t>
+        <w:t xml:space="preserve">3-sided gaming services marketplace (player, expert, admin) shipped end-to-end in 2 months.</w:t>
       </w:r>
     </w:p>
     <w:p>
@@ -1363,7 +1482,7 @@
           <w:sz w:val="17"/>
           <w:szCs w:val="17"/>
         </w:rPr>
-        <w:t xml:space="preserve">Built a configurable ranking and game-management engine enabling new games and ranking systems without backend code changes.</w:t>
+        <w:t xml:space="preserve">Configurable game-management engine: admins onboard new games and ranking systems from the panel without backend code changes.</w:t>
       </w:r>
     </w:p>
     <w:p>
@@ -1382,7 +1501,7 @@
           <w:sz w:val="17"/>
           <w:szCs w:val="17"/>
         </w:rPr>
-        <w:t xml:space="preserve">Designed a Stripe and PayPal-powered multi-currency wallet system with historical FX-rate settlement handling.</w:t>
+        <w:t xml:space="preserve">Cross-game ranking reconciliation across tiered systems (Iron/Gold/Diamond) and flat systems (Master/Grandmaster), so experts could be matched to players across games.</w:t>
       </w:r>
     </w:p>
     <w:p>
@@ -1401,7 +1520,7 @@
           <w:sz w:val="17"/>
           <w:szCs w:val="17"/>
         </w:rPr>
-        <w:t xml:space="preserve">Implemented Socket.IO-based order chat, OAuth authentication, fee splitting, screenshot verification, and admin moderation tooling.</w:t>
+        <w:t xml:space="preserve">Multi-currency wallet with Stripe and PayPal payouts; currency values stored at the rate of the day each transaction settled.</w:t>
       </w:r>
     </w:p>
     <w:p>
@@ -1420,7 +1539,7 @@
           <w:sz w:val="17"/>
           <w:szCs w:val="17"/>
         </w:rPr>
-        <w:t xml:space="preserve">Led system architecture, schema design, backend infrastructure, and developer mentorship.</w:t>
+        <w:t xml:space="preserve">Socket.IO real-time order chat, OAuth, JWT auth, fee-split workflows, screenshot verification, admin moderation tools.</w:t>
       </w:r>
     </w:p>
     <w:p>
@@ -1437,7 +1556,7 @@
           <w:sz w:val="16"/>
           <w:szCs w:val="16"/>
         </w:rPr>
-        <w:t xml:space="preserve">· Next.js · Node.js · Express.js · Prisma · PostgreSQL · Socket.IO · Stripe · PayPal · TypeScript</w:t>
+        <w:t xml:space="preserve">· Next.js · Node.js · Express.js · Prisma · PostgreSQL · Socket.IO · Stripe · PayPal · TypeScript · Vercel</w:t>
       </w:r>
     </w:p>
     <w:p>
@@ -1466,7 +1585,7 @@
         </w:rPr>
         <w:t xml:space="preserve">	</w:t>
       </w:r>
-      <w:hyperlink w:history="1" r:id="rIdcxu7pgtms8brypdufz3bf">
+      <w:hyperlink w:history="1" r:id="rIdyxd1x823lla8magckethi">
         <w:r>
           <w:rPr>
             <w:rFonts w:ascii="Arial" w:cs="Arial" w:eastAsia="Arial" w:hAnsi="Arial"/>
@@ -1490,7 +1609,7 @@
           <w:sz w:val="18"/>
           <w:szCs w:val="18"/>
         </w:rPr>
-        <w:t xml:space="preserve">Operations platform replacing 39 manually managed spreadsheets for a US fuel wholesaler.</w:t>
+        <w:t xml:space="preserve">Operations platform for a 30-year US fuel wholesaler — replaced 39 spreadsheets, daily processing 45–60 min → under 90 sec.</w:t>
       </w:r>
     </w:p>
     <w:p>
@@ -1509,7 +1628,7 @@
           <w:sz w:val="17"/>
           <w:szCs w:val="17"/>
         </w:rPr>
-        <w:t xml:space="preserve">Automated pricing calculations, invoice generation, and customer communication workflows reducing daily processing time to under 90 seconds.</w:t>
+        <w:t xml:space="preserve">3-gate address mapping after free-text driver addresses broke invoice routing: dispatch dropdowns from ops → pre-filled driver forms → Samsara geofence fallback by lat/long.</w:t>
       </w:r>
     </w:p>
     <w:p>
@@ -1528,7 +1647,7 @@
           <w:sz w:val="17"/>
           <w:szCs w:val="17"/>
         </w:rPr>
-        <w:t xml:space="preserve">Built reconciliation pipelines integrating Samsara telematics data with supplier FTP systems through idempotent background jobs.</w:t>
+        <w:t xml:space="preserve">Reconciliation engine across Samsara API (delivered volumes) and supplier FTP (gross/net gallons) with idempotent 3-hour background jobs preventing double counts.</w:t>
       </w:r>
     </w:p>
     <w:p>
@@ -1547,7 +1666,7 @@
           <w:sz w:val="17"/>
           <w:szCs w:val="17"/>
         </w:rPr>
-        <w:t xml:space="preserve">Designed structured dispatch and address-validation workflows replacing inconsistent free-text operational processes.</w:t>
+        <w:t xml:space="preserve">.NET bridge: pulls new invoices from the web app every 3 hours and pushes them to QuickBooks running on the ops team's on-prem machine.</w:t>
       </w:r>
     </w:p>
     <w:p>
@@ -1566,7 +1685,7 @@
           <w:sz w:val="17"/>
           <w:szCs w:val="17"/>
         </w:rPr>
-        <w:t xml:space="preserve">Integrated on-prem QuickBooks systems through a custom bridge syncing accounting data from platform APIs.</w:t>
+        <w:t xml:space="preserve">Per-customer pricing engine with margin overrides; new prices auto-emailed with each customer's specific margins applied.</w:t>
       </w:r>
     </w:p>
     <w:p>
@@ -1583,7 +1702,7 @@
           <w:sz w:val="16"/>
           <w:szCs w:val="16"/>
         </w:rPr>
-        <w:t xml:space="preserve">· Next.js · Node.js · Express.js · PostgreSQL · AWS · Samsara API · QuickBooks</w:t>
+        <w:t xml:space="preserve">· Next.js · Node.js · PostgreSQL · AWS · Samsara API · QuickBooks · .NET bridge</w:t>
       </w:r>
     </w:p>
     <w:p>

</xml_diff>

<commit_message>
Resume: fix education date in PDF (Nov 2018–May 2022)
Source scripts in ~/Desktop/job-hunt also cleaned up — dead writing_DISABLED
block removed, narration comments dropped, single-element bulletRich calls
collapsed to a bullet() helper. PDF education dates now match the DOCX
canonical form set in ecb4c36.

Co-Authored-By: Claude Opus 4.7 (1M context) <noreply@anthropic.com>
</commit_message>
<xml_diff>
--- a/public/uzair-saleem-resume.docx
+++ b/public/uzair-saleem-resume.docx
@@ -45,7 +45,7 @@
         </w:rPr>
         <w:t xml:space="preserve">Islamabad, Pakistan  ·  </w:t>
       </w:r>
-      <w:hyperlink w:history="1" r:id="rId91yfupyvx1vgakieghbjm">
+      <w:hyperlink w:history="1" r:id="rIdy-61plrydiwj5azhx6tys">
         <w:r>
           <w:rPr>
             <w:rFonts w:ascii="Arial" w:cs="Arial" w:eastAsia="Arial" w:hAnsi="Arial"/>
@@ -66,7 +66,7 @@
         </w:rPr>
         <w:t xml:space="preserve">  ·  </w:t>
       </w:r>
-      <w:hyperlink w:history="1" r:id="rIdgn-zjt8cqclqeubc5ohou">
+      <w:hyperlink w:history="1" r:id="rIdnn9kcsm8yie4a1lph23w0">
         <w:r>
           <w:rPr>
             <w:rFonts w:ascii="Arial" w:cs="Arial" w:eastAsia="Arial" w:hAnsi="Arial"/>
@@ -87,7 +87,7 @@
         </w:rPr>
         <w:t xml:space="preserve">  ·  </w:t>
       </w:r>
-      <w:hyperlink w:history="1" r:id="rIdtxo-uqmhcopillfkggfny">
+      <w:hyperlink w:history="1" r:id="rIdvlxsh6jtt1syq7zde68b0">
         <w:r>
           <w:rPr>
             <w:rFonts w:ascii="Arial" w:cs="Arial" w:eastAsia="Arial" w:hAnsi="Arial"/>
@@ -108,7 +108,7 @@
         </w:rPr>
         <w:t xml:space="preserve">  ·  </w:t>
       </w:r>
-      <w:hyperlink w:history="1" r:id="rIdt_-q8h2iyd9crrbwohypo">
+      <w:hyperlink w:history="1" r:id="rIdqjwktjui_3pp0ircrvjqe">
         <w:r>
           <w:rPr>
             <w:rFonts w:ascii="Arial" w:cs="Arial" w:eastAsia="Arial" w:hAnsi="Arial"/>
@@ -129,7 +129,7 @@
         </w:rPr>
         <w:t xml:space="preserve">  ·  </w:t>
       </w:r>
-      <w:hyperlink w:history="1" r:id="rIdxin1dqzddubox8mesrqfi">
+      <w:hyperlink w:history="1" r:id="rIdem-7qwxn_2aw-3tom2kyy">
         <w:r>
           <w:rPr>
             <w:rFonts w:ascii="Arial" w:cs="Arial" w:eastAsia="Arial" w:hAnsi="Arial"/>
@@ -1293,7 +1293,7 @@
         </w:rPr>
         <w:t xml:space="preserve">	</w:t>
       </w:r>
-      <w:hyperlink w:history="1" r:id="rIdizomfei6opubhvz7qqu5r">
+      <w:hyperlink w:history="1" r:id="rIdb-wvycdpphbcpmd67jpt8">
         <w:r>
           <w:rPr>
             <w:rFonts w:ascii="Arial" w:cs="Arial" w:eastAsia="Arial" w:hAnsi="Arial"/>
@@ -1439,7 +1439,7 @@
         </w:rPr>
         <w:t xml:space="preserve">	</w:t>
       </w:r>
-      <w:hyperlink w:history="1" r:id="rIdohehxqnlggliug03caril">
+      <w:hyperlink w:history="1" r:id="rIdxtyb4ie5pzkzbetl-m_ci">
         <w:r>
           <w:rPr>
             <w:rFonts w:ascii="Arial" w:cs="Arial" w:eastAsia="Arial" w:hAnsi="Arial"/>
@@ -1585,7 +1585,7 @@
         </w:rPr>
         <w:t xml:space="preserve">	</w:t>
       </w:r>
-      <w:hyperlink w:history="1" r:id="rIdyxd1x823lla8magckethi">
+      <w:hyperlink w:history="1" r:id="rIdek8mhgehuco5x4hlrgmxc">
         <w:r>
           <w:rPr>
             <w:rFonts w:ascii="Arial" w:cs="Arial" w:eastAsia="Arial" w:hAnsi="Arial"/>

</xml_diff>

<commit_message>
Drop "Senior" title across site + resume, apply writing-voice rules
Removes "Senior Full-Stack Engineer" framing from hero, metadata,
blog footer, JSON-LD schema, and resume header/body. Now reads as
"Full-Stack Engineer" everywhere. The Junior → Senior promotion bullet
at Apifiny is reframed as "Promoted twice in 18 months."

Resume bullets updated under writing-voice rules: em-dashes replaced
with periods for shorter, fragment-friendly cadence.

Co-Authored-By: Claude Opus 4.7 (1M context) <noreply@anthropic.com>
</commit_message>
<xml_diff>
--- a/public/uzair-saleem-resume.docx
+++ b/public/uzair-saleem-resume.docx
@@ -29,7 +29,7 @@
           <w:sz w:val="22"/>
           <w:szCs w:val="22"/>
         </w:rPr>
-        <w:t xml:space="preserve">Senior Full-Stack Engineer</w:t>
+        <w:t xml:space="preserve">Full-Stack Engineer</w:t>
       </w:r>
     </w:p>
     <w:p>
@@ -45,7 +45,7 @@
         </w:rPr>
         <w:t xml:space="preserve">Islamabad, Pakistan  ·  </w:t>
       </w:r>
-      <w:hyperlink w:history="1" r:id="rIdy-61plrydiwj5azhx6tys">
+      <w:hyperlink w:history="1" r:id="rIdfgt6uws2zazziyansmulr">
         <w:r>
           <w:rPr>
             <w:rFonts w:ascii="Arial" w:cs="Arial" w:eastAsia="Arial" w:hAnsi="Arial"/>
@@ -66,7 +66,7 @@
         </w:rPr>
         <w:t xml:space="preserve">  ·  </w:t>
       </w:r>
-      <w:hyperlink w:history="1" r:id="rIdnn9kcsm8yie4a1lph23w0">
+      <w:hyperlink w:history="1" r:id="rIdfsmba4b8si65zud4zgfbq">
         <w:r>
           <w:rPr>
             <w:rFonts w:ascii="Arial" w:cs="Arial" w:eastAsia="Arial" w:hAnsi="Arial"/>
@@ -87,7 +87,7 @@
         </w:rPr>
         <w:t xml:space="preserve">  ·  </w:t>
       </w:r>
-      <w:hyperlink w:history="1" r:id="rIdvlxsh6jtt1syq7zde68b0">
+      <w:hyperlink w:history="1" r:id="rId0nizbkc2lxosylppdfsbg">
         <w:r>
           <w:rPr>
             <w:rFonts w:ascii="Arial" w:cs="Arial" w:eastAsia="Arial" w:hAnsi="Arial"/>
@@ -108,7 +108,7 @@
         </w:rPr>
         <w:t xml:space="preserve">  ·  </w:t>
       </w:r>
-      <w:hyperlink w:history="1" r:id="rIdqjwktjui_3pp0ircrvjqe">
+      <w:hyperlink w:history="1" r:id="rId75qp6xyxx_4c7glubhe9h">
         <w:r>
           <w:rPr>
             <w:rFonts w:ascii="Arial" w:cs="Arial" w:eastAsia="Arial" w:hAnsi="Arial"/>
@@ -129,7 +129,7 @@
         </w:rPr>
         <w:t xml:space="preserve">  ·  </w:t>
       </w:r>
-      <w:hyperlink w:history="1" r:id="rIdem-7qwxn_2aw-3tom2kyy">
+      <w:hyperlink w:history="1" r:id="rIdl6saplf1ymz-fdff39wss">
         <w:r>
           <w:rPr>
             <w:rFonts w:ascii="Arial" w:cs="Arial" w:eastAsia="Arial" w:hAnsi="Arial"/>
@@ -173,7 +173,7 @@
           <w:sz w:val="18"/>
           <w:szCs w:val="18"/>
         </w:rPr>
-        <w:t xml:space="preserve">Senior full-stack engineer, 5 years shipping production SaaS end-to-end on Next.js, Node.js, PostgreSQL, and Supabase. Lead engineer at Rocket Devs on two founder-client builds: </w:t>
+        <w:t xml:space="preserve">Full-stack engineer, 5 years shipping production SaaS end-to-end on Next.js, Node.js, PostgreSQL, and Supabase. Lead engineer at Rocket Devs on two founder-client builds: </w:t>
       </w:r>
       <w:r>
         <w:rPr>
@@ -213,7 +213,7 @@
           <w:sz w:val="18"/>
           <w:szCs w:val="18"/>
         </w:rPr>
-        <w:t xml:space="preserve"> (operations platform that replaced 39 spreadsheets for a 30-year US fuel wholesaler). Promoted Junior → Senior at Apifiny in 18 months on a 3-person agency team. AI-assisted development (Claude Code, agentic workflows) is part of how I ship daily.</w:t>
+        <w:t xml:space="preserve"> (operations platform that replaced 39 spreadsheets for a 30-year US fuel wholesaler). Promoted twice at Apifiny in 18 months on a 3-person agency team. AI-assisted development (Claude Code, agentic workflows) is part of how I ship daily.</w:t>
       </w:r>
     </w:p>
     <w:p>
@@ -447,7 +447,7 @@
           <w:sz w:val="20"/>
           <w:szCs w:val="20"/>
         </w:rPr>
-        <w:t xml:space="preserve">Senior Full-Stack Engineer  —  Rocket Devs</w:t>
+        <w:t xml:space="preserve">Full-Stack Engineer — Rocket Devs</w:t>
       </w:r>
       <w:r>
         <w:rPr>
@@ -581,7 +581,7 @@
           <w:sz w:val="18"/>
           <w:szCs w:val="18"/>
         </w:rPr>
-        <w:t xml:space="preserve">Solved Stripe's 3-month event retention limit by anchoring historical MRR to invoice data while keeping the event path live for real-time changes — both writing to the same ledger keys for deterministic reconciliation.</w:t>
+        <w:t xml:space="preserve">Solved Stripe's 3-month event retention limit by anchoring historical MRR to invoice data while keeping the event path live for real-time changes. Both writing to the same ledger keys for deterministic reconciliation.</w:t>
       </w:r>
     </w:p>
     <w:p>
@@ -639,7 +639,7 @@
           <w:sz w:val="18"/>
           <w:szCs w:val="18"/>
         </w:rPr>
-        <w:t xml:space="preserve"> at Sat-Raj with a unified ops platform — daily processing dropped from </w:t>
+        <w:t xml:space="preserve"> at Sat-Raj with a unified ops platform. Daily processing dropped from </w:t>
       </w:r>
       <w:r>
         <w:rPr>
@@ -717,7 +717,7 @@
           <w:sz w:val="20"/>
           <w:szCs w:val="20"/>
         </w:rPr>
-        <w:t xml:space="preserve">Full-Stack Engineer  —  Design&amp;Desktop</w:t>
+        <w:t xml:space="preserve">Full-Stack Engineer — Design&amp;Desktop</w:t>
       </w:r>
       <w:r>
         <w:rPr>
@@ -792,7 +792,7 @@
           <w:sz w:val="18"/>
           <w:szCs w:val="18"/>
         </w:rPr>
-        <w:t xml:space="preserve">Migrated rendering from FFmpeg.wasm to MediaBunny after browser-side renders ran 2–10 min with high device variance; new pipeline ~20 sec consistent across browsers — </w:t>
+        <w:t xml:space="preserve">Migrated rendering from FFmpeg.wasm to MediaBunny after browser-side renders ran 2–10 min with high device variance; new pipeline ~20 sec consistent across browsers. </w:t>
       </w:r>
       <w:r>
         <w:rPr>
@@ -831,7 +831,7 @@
           <w:sz w:val="18"/>
           <w:szCs w:val="18"/>
         </w:rPr>
-        <w:t xml:space="preserve">Rebuilt the Germany restaurant scraping pipeline: converted sequential Chromium scraping to 5-way parallel batch with per-platform throttling for sites that blocked aggressive crawling — </w:t>
+        <w:t xml:space="preserve">Rebuilt the Germany restaurant scraping pipeline: converted sequential Chromium scraping to 5-way parallel batch with per-platform throttling for sites that blocked aggressive crawling. </w:t>
       </w:r>
       <w:r>
         <w:rPr>
@@ -928,7 +928,7 @@
           <w:sz w:val="20"/>
           <w:szCs w:val="20"/>
         </w:rPr>
-        <w:t xml:space="preserve">Senior Engineer  —  Apifiny</w:t>
+        <w:t xml:space="preserve">Engineer — Apifiny</w:t>
       </w:r>
       <w:r>
         <w:rPr>
@@ -1004,7 +1004,7 @@
           <w:sz w:val="18"/>
           <w:szCs w:val="18"/>
         </w:rPr>
-        <w:t xml:space="preserve"> — a 3-sided gaming services marketplace (player, expert, admin) — </w:t>
+        <w:t xml:space="preserve">. A 3-sided gaming services marketplace (player, expert, admin). </w:t>
       </w:r>
       <w:r>
         <w:rPr>
@@ -1024,7 +1024,7 @@
           <w:sz w:val="18"/>
           <w:szCs w:val="18"/>
         </w:rPr>
-        <w:t xml:space="preserve"> as senior engineer on a 3-person team.</w:t>
+        <w:t xml:space="preserve"> as engineer on a 3-person team.</w:t>
       </w:r>
     </w:p>
     <w:p>
@@ -1158,7 +1158,7 @@
           <w:sz w:val="20"/>
           <w:szCs w:val="20"/>
         </w:rPr>
-        <w:t xml:space="preserve">Junior to Mid Engineer  —  Apifiny</w:t>
+        <w:t xml:space="preserve">Junior to Mid Engineer — Apifiny</w:t>
       </w:r>
       <w:r>
         <w:rPr>
@@ -1216,7 +1216,7 @@
           <w:sz w:val="18"/>
           <w:szCs w:val="18"/>
         </w:rPr>
-        <w:t xml:space="preserve">Promoted Junior → Senior in 18 months</w:t>
+        <w:t xml:space="preserve">Promoted twice in 18 months</w:t>
       </w:r>
       <w:r>
         <w:rPr>
@@ -1244,7 +1244,7 @@
           <w:sz w:val="18"/>
           <w:szCs w:val="18"/>
         </w:rPr>
-        <w:t xml:space="preserve">Shipped features across B2B SaaS products: frontend dashboards, backend APIs, schema design, and internal admin tooling. Expanded into full-stack architecture work that led directly into the Diffed.gg senior role.</w:t>
+        <w:t xml:space="preserve">Shipped features across B2B SaaS products: frontend dashboards, backend APIs, schema design, and internal admin tooling. Expanded into full-stack architecture work that led directly into the Diffed.gg lead role.</w:t>
       </w:r>
     </w:p>
     <w:p>
@@ -1293,7 +1293,7 @@
         </w:rPr>
         <w:t xml:space="preserve">	</w:t>
       </w:r>
-      <w:hyperlink w:history="1" r:id="rIdb-wvycdpphbcpmd67jpt8">
+      <w:hyperlink w:history="1" r:id="rIdkmuq5k3yfb0m1lhxkes6k">
         <w:r>
           <w:rPr>
             <w:rFonts w:ascii="Arial" w:cs="Arial" w:eastAsia="Arial" w:hAnsi="Arial"/>
@@ -1336,7 +1336,7 @@
           <w:sz w:val="17"/>
           <w:szCs w:val="17"/>
         </w:rPr>
-        <w:t xml:space="preserve">Three idempotent ingestion flows feeding one ledger: live webhooks, 24-hour catch-up cron on GitHub Actions, and 2-year historical backfill — all converging on the same row keys.</w:t>
+        <w:t xml:space="preserve">Three idempotent ingestion flows feeding one ledger: live webhooks, 24-hour catch-up cron on GitHub Actions, and 2-year historical backfill. All converging on the same row keys.</w:t>
       </w:r>
     </w:p>
     <w:p>
@@ -1374,7 +1374,7 @@
           <w:sz w:val="17"/>
           <w:szCs w:val="17"/>
         </w:rPr>
-        <w:t xml:space="preserve">Per-day historical FX across 30 display currencies via ECB rates — historical revenue charts don't shift when today's rates move.</w:t>
+        <w:t xml:space="preserve">Per-day historical FX across 30 display currencies via ECB rates. Historical revenue charts don't shift when today's rates move.</w:t>
       </w:r>
     </w:p>
     <w:p>
@@ -1439,7 +1439,7 @@
         </w:rPr>
         <w:t xml:space="preserve">	</w:t>
       </w:r>
-      <w:hyperlink w:history="1" r:id="rIdxtyb4ie5pzkzbetl-m_ci">
+      <w:hyperlink w:history="1" r:id="rId0mjivy5wda_bysnggebbp">
         <w:r>
           <w:rPr>
             <w:rFonts w:ascii="Arial" w:cs="Arial" w:eastAsia="Arial" w:hAnsi="Arial"/>
@@ -1585,7 +1585,7 @@
         </w:rPr>
         <w:t xml:space="preserve">	</w:t>
       </w:r>
-      <w:hyperlink w:history="1" r:id="rIdek8mhgehuco5x4hlrgmxc">
+      <w:hyperlink w:history="1" r:id="rIdpldvkc_8vcuyyxk76fdru">
         <w:r>
           <w:rPr>
             <w:rFonts w:ascii="Arial" w:cs="Arial" w:eastAsia="Arial" w:hAnsi="Arial"/>
@@ -1609,7 +1609,7 @@
           <w:sz w:val="18"/>
           <w:szCs w:val="18"/>
         </w:rPr>
-        <w:t xml:space="preserve">Operations platform for a 30-year US fuel wholesaler — replaced 39 spreadsheets, daily processing 45–60 min → under 90 sec.</w:t>
+        <w:t xml:space="preserve">Operations platform for a 30-year US fuel wholesaler. Replaced 39 spreadsheets, daily processing 45–60 min → under 90 sec.</w:t>
       </w:r>
     </w:p>
     <w:p>

</xml_diff>